<commit_message>
refactor: update unit names to Xã Đốc Binh Kiều
Update UI header and party document generation scripts to reflect the change from UBND Huyện Tháp Mười to UBND Xã Đốc Binh Kiều.
</commit_message>
<xml_diff>
--- a/public/downloads/01_QC_DU_Quy_che_lam_viec_BCH_Dang_bo_2025_2030.docx
+++ b/public/downloads/01_QC_DU_Quy_che_lam_viec_BCH_Dang_bo_2025_2030.docx
@@ -42,7 +42,7 @@
                 <w:sz w:val="24"/>
                 <w:szCs w:val="24"/>
               </w:rPr>
-              <w:t xml:space="preserve">ĐẢNG BỘ HUYỆN THÁP MƯỜI</w:t>
+              <w:t xml:space="preserve">ĐẢNG BỘ XÃ ĐỐC BINH KIỀU</w:t>
             </w:r>
           </w:p>
           <w:p>
@@ -284,7 +284,7 @@
           <w:sz w:val="24"/>
           <w:szCs w:val="24"/>
         </w:rPr>
-        <w:t xml:space="preserve">- Căn cứ Quyết định của Ủy ban nhân dân tỉnh Đồng Tháp về việc sáp nhập Trường THPT Đốc Binh Kiều, Trường THCS Đốc Binh Kiều và Trường THCS Tân Kiều thành Trường THCS và THPT Đốc Binh Kiều;</w:t>
+        <w:t xml:space="preserve">- Căn cứ chủ trương của Trung ương và Tỉnh ủy Đồng Tháp về tổ chức mô hình chính quyền địa phương 02 cấp và sáp nhập đơn vị hành chính xã Tân Kiều vào xã Đốc Binh Kiều;</w:t>
       </w:r>
     </w:p>
     <w:p>
@@ -302,7 +302,7 @@
           <w:sz w:val="24"/>
           <w:szCs w:val="24"/>
         </w:rPr>
-        <w:t xml:space="preserve">- Căn cứ Quyết định của Ban Thường vụ Huyện ủy Tháp Mười về việc chỉ định Ban Chấp hành Đảng bộ Trường THCS và THPT Đốc Binh Kiều khóa I, nhiệm kỳ 2025 – 2030 gồm 10 đồng chí;</w:t>
+        <w:t xml:space="preserve">- Căn cứ Quyết định của Ủy ban nhân dân tỉnh Đồng Tháp về việc sáp nhập Trường THPT Đốc Binh Kiều, Trường THCS Đốc Binh Kiều và Trường THCS Tân Kiều thành Trường THCS và THPT Đốc Binh Kiều;</w:t>
       </w:r>
     </w:p>
     <w:p>
@@ -320,7 +320,25 @@
           <w:sz w:val="24"/>
           <w:szCs w:val="24"/>
         </w:rPr>
-        <w:t xml:space="preserve">Căn cứ Nghị quyết Đại hội đại biểu Đảng bộ khóa I và Phương hướng, mục tiêu, nhiệm vụ công tác xây dựng Đảng và lãnh đạo thực hiện nhiệm vụ chính trị của nhà trường nhiệm kỳ 2025 – 2030;</w:t>
+        <w:t xml:space="preserve">- Căn cứ Quyết định của Đảng ủy xã Đốc Binh Kiều về việc chỉ định Ban Chấp hành Đảng bộ Trường THCS và THPT Đốc Binh Kiều khóa I, nhiệm kỳ 2025 – 2030 gồm 10 đồng chí;</w:t>
+      </w:r>
+    </w:p>
+    <w:p>
+      <w:pPr>
+        <w:spacing w:after="60" w:before="60" w:line="276"/>
+        <w:jc w:val="both"/>
+      </w:pPr>
+      <w:r>
+        <w:rPr>
+          <w:rFonts w:ascii="Times New Roman" w:cs="Times New Roman" w:eastAsia="Times New Roman" w:hAnsi="Times New Roman"/>
+          <w:b w:val="false"/>
+          <w:bCs w:val="false"/>
+          <w:i/>
+          <w:iCs/>
+          <w:sz w:val="24"/>
+          <w:szCs w:val="24"/>
+        </w:rPr>
+        <w:t xml:space="preserve">Căn cứ Nghị quyết Đại hội Đảng bộ xã Đốc Binh Kiều và Phương hướng, mục tiêu, nhiệm vụ công tác xây dựng Đảng của Đảng bộ Trường THCS và THPT Đốc Binh Kiều khóa I, nhiệm kỳ 2025 – 2030;</w:t>
       </w:r>
     </w:p>
     <w:p>
@@ -391,25 +409,25 @@
           <w:sz w:val="26"/>
           <w:szCs w:val="26"/>
         </w:rPr>
-        <w:t xml:space="preserve">1. Thực hiện đầy đủ nhiệm vụ, quyền hạn của cấp uỷ cơ sở theo quy định của Điều lệ Đảng, các quy định, hướng dẫn của Trung ương, Tỉnh ủy Đồng Tháp và Huyện ủy Tháp Mười. Lãnh đạo, chỉ đạo toàn diện các tổ chức trong hệ thống chính trị nhà trường (Ban Giám hiệu, Công đoàn cơ sở, Đoàn TNCS Hồ Chí Minh, Hội Khuyến học) và 03 chi bộ trực thuộc, cùng toàn thể 85 đảng viên, 120 cán bộ, giáo viên, nhân viên thực hiện nghiêm đường lối, chủ trương của Đảng, chính sách, pháp luật của Nhà nước.</w:t>
-      </w:r>
-    </w:p>
-    <w:p>
-      <w:pPr>
-        <w:spacing w:after="60" w:before="60" w:line="276"/>
-        <w:jc w:val="both"/>
-      </w:pPr>
-      <w:r>
-        <w:rPr>
-          <w:rFonts w:ascii="Times New Roman" w:cs="Times New Roman" w:eastAsia="Times New Roman" w:hAnsi="Times New Roman"/>
-          <w:b w:val="false"/>
-          <w:bCs w:val="false"/>
-          <w:i w:val="false"/>
-          <w:iCs w:val="false"/>
-          <w:sz w:val="26"/>
-          <w:szCs w:val="26"/>
-        </w:rPr>
-        <w:t xml:space="preserve">2. Lãnh đạo thực hiện thắng lợi nhiệm vụ chính trị trọng tâm của đơn vị mới sau sáp nhập: Quản lý và phát triển chất lượng dạy và học trên cả 03 điểm trường (Điểm chính THPT Đốc Binh Kiều, Điểm THCS Đốc Binh Kiều, Điểm THCS Tân Kiều) với quy mô 53 lớp, 2.111 học sinh (trong đó có 25 học sinh khuyết tật học hòa nhập); cụ thể hóa các chỉ đạo chuyên môn của Sở Giáo dục và Đào tạo Đồng Tháp thành các nghị quyết, chương trình hành động phù hợp thực tiễn.</w:t>
+        <w:t xml:space="preserve">1. Thực hiện đầy đủ nhiệm vụ, quyền hạn của cấp uỷ cơ sở trực thuộc Đảng bộ xã Đốc Binh Kiều theo quy định của Điều lệ Đảng, các quy định, hướng dẫn của Trung ương, Tỉnh ủy Đồng Tháp và Đảng ủy xã Đốc Binh Kiều. Lãnh đạo, chỉ đạo toàn diện các tổ chức trong hệ thống chính trị nhà trường (Ban Giám hiệu, Công đoàn cơ sở, Đoàn TNCS Hồ Chí Minh, Hội Khuyến học) và 03 chi bộ trực thuộc, cùng toàn thể 85 đảng viên, 120 cán bộ, giáo viên, nhân viên thực hiện nghiêm đường lối, chủ trương của Đảng, chính sách, pháp luật của Nhà nước.</w:t>
+      </w:r>
+    </w:p>
+    <w:p>
+      <w:pPr>
+        <w:spacing w:after="60" w:before="60" w:line="276"/>
+        <w:jc w:val="both"/>
+      </w:pPr>
+      <w:r>
+        <w:rPr>
+          <w:rFonts w:ascii="Times New Roman" w:cs="Times New Roman" w:eastAsia="Times New Roman" w:hAnsi="Times New Roman"/>
+          <w:b w:val="false"/>
+          <w:bCs w:val="false"/>
+          <w:i w:val="false"/>
+          <w:iCs w:val="false"/>
+          <w:sz w:val="26"/>
+          <w:szCs w:val="26"/>
+        </w:rPr>
+        <w:t xml:space="preserve">2. Lãnh đạo thực hiện thắng lợi nhiệm vụ chính trị trọng tâm của đơn vị mới sau sáp nhập: Quản lý và phát triển chất lượng dạy và học trên cả 03 điểm trường (Điểm chính THPT Đốc Binh Kiều, Điểm THCS Đốc Binh Kiều, Điểm THCS Tân Kiều thuộc địa bàn xã Đốc Binh Kiều sau sáp nhập) với quy mô 53 lớp, 2.111 học sinh (trong đó có 25 học sinh khuyết tật học hòa nhập); cụ thể hóa các chỉ đạo chuyên môn của Sở Giáo dục và Đào tạo Đồng Tháp và nhiệm vụ phát triển kinh tế - xã hội của Đảng ủy, UBND xã Đốc Binh Kiều.</w:t>
       </w:r>
     </w:p>
     <w:p>
@@ -463,79 +481,79 @@
           <w:sz w:val="26"/>
           <w:szCs w:val="26"/>
         </w:rPr>
-        <w:t xml:space="preserve">- Tổ chức học tập, quán triệt sâu sắc các nghị quyết, chỉ thị, kết luận của Trung ương; bảo vệ nền tảng tư tưởng của Đảng, kiên quyết đấu tranh phản bác các quan điểm sai trái, thù địch theo Nghị quyết số 35-NQ/TW của Bộ Chính trị.</w:t>
-      </w:r>
-    </w:p>
-    <w:p>
-      <w:pPr>
-        <w:spacing w:after="60" w:before="60" w:line="276"/>
-        <w:jc w:val="both"/>
-      </w:pPr>
-      <w:r>
-        <w:rPr>
-          <w:rFonts w:ascii="Times New Roman" w:cs="Times New Roman" w:eastAsia="Times New Roman" w:hAnsi="Times New Roman"/>
-          <w:b w:val="false"/>
-          <w:bCs w:val="false"/>
-          <w:i w:val="false"/>
-          <w:iCs w:val="false"/>
-          <w:sz w:val="26"/>
-          <w:szCs w:val="26"/>
-        </w:rPr>
-        <w:t xml:space="preserve">- Đẩy mạnh việc học tập và làm theo tư tưởng, đạo đức, phong cách Hồ Chí Minh gắn với thực hiện Kết luận số 21-KL/TW về xây dựng, chỉnh đốn Đảng; xây dựng chuẩn mực văn hóa nhà trường, tinh thần tương trợ, đoàn kết thống nhất giữa đội ngũ giáo viên từ 3 trường sau sáp nhập; phấn đấu trong nhiệm kỳ có ít nhất 02 mô hình tập thể, cá nhân tiêu biểu được cấp trên biểu dương, khen thưởng.</w:t>
-      </w:r>
-    </w:p>
-    <w:p>
-      <w:pPr>
-        <w:spacing w:after="60" w:before="60" w:line="276"/>
-        <w:jc w:val="both"/>
-      </w:pPr>
-      <w:r>
-        <w:rPr>
-          <w:rFonts w:ascii="Times New Roman" w:cs="Times New Roman" w:eastAsia="Times New Roman" w:hAnsi="Times New Roman"/>
-          <w:b w:val="false"/>
-          <w:bCs w:val="false"/>
-          <w:i w:val="false"/>
-          <w:iCs w:val="false"/>
-          <w:sz w:val="26"/>
-          <w:szCs w:val="26"/>
-        </w:rPr>
-        <w:t xml:space="preserve">5. Lãnh đạo, chỉ đạo 03 chi bộ trực thuộc (Chi bộ 1, Chi bộ 2, Chi bộ 3) thực hiện tốt quy chế dân chủ ở cơ sở; thường xuyên lắng nghe, nắm bắt và giải quyết kịp thời tâm tư, nguyện vọng của cán bộ, giáo viên, nhân viên, học sinh và cha mẹ học sinh.</w:t>
-      </w:r>
-    </w:p>
-    <w:p>
-      <w:pPr>
-        <w:spacing w:after="60" w:before="60" w:line="276"/>
-        <w:jc w:val="both"/>
-      </w:pPr>
-      <w:r>
-        <w:rPr>
-          <w:rFonts w:ascii="Times New Roman" w:cs="Times New Roman" w:eastAsia="Times New Roman" w:hAnsi="Times New Roman"/>
-          <w:b w:val="false"/>
-          <w:bCs w:val="false"/>
-          <w:i w:val="false"/>
-          <w:iCs w:val="false"/>
-          <w:sz w:val="26"/>
-          <w:szCs w:val="26"/>
-        </w:rPr>
-        <w:t xml:space="preserve">6. Lãnh đạo công tác phát triển đảng viên mới: Chú trọng phát hiện, bồi dưỡng nguồn kết nạp là giáo viên trẻ, giáo viên dạy giỏi và đoàn viên học sinh lớp 12 ưu tú; phấn đấu hàng năm kết nạp từ 03 - 04 đảng viên mới, hoàn thành và vượt chỉ tiêu Huyện ủy giao.</w:t>
-      </w:r>
-    </w:p>
-    <w:p>
-      <w:pPr>
-        <w:spacing w:after="60" w:before="60" w:line="276"/>
-        <w:jc w:val="both"/>
-      </w:pPr>
-      <w:r>
-        <w:rPr>
-          <w:rFonts w:ascii="Times New Roman" w:cs="Times New Roman" w:eastAsia="Times New Roman" w:hAnsi="Times New Roman"/>
-          <w:b w:val="false"/>
-          <w:bCs w:val="false"/>
-          <w:i w:val="false"/>
-          <w:iCs w:val="false"/>
-          <w:sz w:val="26"/>
-          <w:szCs w:val="26"/>
-        </w:rPr>
-        <w:t xml:space="preserve">7. Lãnh đạo công tác tổ chức, cán bộ theo phân cấp quản lý: Tham gia ý kiến, kiến nghị với Sở GDĐT Đồng Tháp về quy hoạch, bổ nhiệm, bổ nhiệm lại, điều động, luân chuyển cán bộ quản lý (Ban Giám hiệu); quyết định theo thẩm quyền việc quy hoạch cấp ủy, bổ nhiệm tổ trưởng, tổ phó chuyên môn, nâng lương, thi đua khen thưởng và kỷ luật viên chức.</w:t>
+        <w:t xml:space="preserve">- Tổ chức học tập, quán triệt sâu sắc các nghị quyết, chỉ thị, kết luận của Trung ương và Đảng bộ xã Đốc Binh Kiều; bảo vệ nền tảng tư tưởng của Đảng, kiên quyết đấu tranh phản bác các quan điểm sai trái, thù địch theo Nghị quyết số 35-NQ/TW của Bộ Chính trị.</w:t>
+      </w:r>
+    </w:p>
+    <w:p>
+      <w:pPr>
+        <w:spacing w:after="60" w:before="60" w:line="276"/>
+        <w:jc w:val="both"/>
+      </w:pPr>
+      <w:r>
+        <w:rPr>
+          <w:rFonts w:ascii="Times New Roman" w:cs="Times New Roman" w:eastAsia="Times New Roman" w:hAnsi="Times New Roman"/>
+          <w:b w:val="false"/>
+          <w:bCs w:val="false"/>
+          <w:i w:val="false"/>
+          <w:iCs w:val="false"/>
+          <w:sz w:val="26"/>
+          <w:szCs w:val="26"/>
+        </w:rPr>
+        <w:t xml:space="preserve">- Đẩy mạnh việc học tập và làm theo tư tưởng, đạo đức, phong cách Hồ Chí Minh gắn với thực hiện Kết luận số 21-KL/TW về xây dựng, chỉnh đốn Đảng; xây dựng chuẩn mực văn hóa nhà trường, tinh thần tương trợ, đoàn kết thống nhất giữa đội ngũ giáo viên từ 3 trường sau sáp nhập; phấn đấu trong nhiệm kỳ có ít nhất 02 mô hình tập thể, cá nhân tiêu biểu được Đảng ủy cấp trên khen thưởng.</w:t>
+      </w:r>
+    </w:p>
+    <w:p>
+      <w:pPr>
+        <w:spacing w:after="60" w:before="60" w:line="276"/>
+        <w:jc w:val="both"/>
+      </w:pPr>
+      <w:r>
+        <w:rPr>
+          <w:rFonts w:ascii="Times New Roman" w:cs="Times New Roman" w:eastAsia="Times New Roman" w:hAnsi="Times New Roman"/>
+          <w:b w:val="false"/>
+          <w:bCs w:val="false"/>
+          <w:i w:val="false"/>
+          <w:iCs w:val="false"/>
+          <w:sz w:val="26"/>
+          <w:szCs w:val="26"/>
+        </w:rPr>
+        <w:t xml:space="preserve">5. Lãnh đạo, chỉ đạo 03 chi bộ trực thuộc (Chi bộ 1, Chi bộ 2, Chi bộ 3) thực hiện tốt quy chế dân chủ ở cơ sở; thường xuyên lắng nghe, nắm bắt và giải quyết kịp thời tâm tư, nguyện vọng của cán bộ, giáo viên, nhân viên, học sinh và nhân dân trên địa bàn xã Đốc Binh Kiều.</w:t>
+      </w:r>
+    </w:p>
+    <w:p>
+      <w:pPr>
+        <w:spacing w:after="60" w:before="60" w:line="276"/>
+        <w:jc w:val="both"/>
+      </w:pPr>
+      <w:r>
+        <w:rPr>
+          <w:rFonts w:ascii="Times New Roman" w:cs="Times New Roman" w:eastAsia="Times New Roman" w:hAnsi="Times New Roman"/>
+          <w:b w:val="false"/>
+          <w:bCs w:val="false"/>
+          <w:i w:val="false"/>
+          <w:iCs w:val="false"/>
+          <w:sz w:val="26"/>
+          <w:szCs w:val="26"/>
+        </w:rPr>
+        <w:t xml:space="preserve">6. Lãnh đạo công tác phát triển đảng viên mới: Chú trọng phát hiện, bồi dưỡng nguồn kết nạp là giáo viên trẻ, giáo viên dạy giỏi và đoàn viên học sinh lớp 12 ưu tú; phấn đấu hàng năm kết nạp từ 03 - 04 đảng viên mới, hoàn thành và vượt chỉ tiêu Đảng ủy xã Đốc Binh Kiều giao.</w:t>
+      </w:r>
+    </w:p>
+    <w:p>
+      <w:pPr>
+        <w:spacing w:after="60" w:before="60" w:line="276"/>
+        <w:jc w:val="both"/>
+      </w:pPr>
+      <w:r>
+        <w:rPr>
+          <w:rFonts w:ascii="Times New Roman" w:cs="Times New Roman" w:eastAsia="Times New Roman" w:hAnsi="Times New Roman"/>
+          <w:b w:val="false"/>
+          <w:bCs w:val="false"/>
+          <w:i w:val="false"/>
+          <w:iCs w:val="false"/>
+          <w:sz w:val="26"/>
+          <w:szCs w:val="26"/>
+        </w:rPr>
+        <w:t xml:space="preserve">7. Lãnh đạo công tác tổ chức, cán bộ theo phân cấp quản lý: Tham gia ý kiến, kiến nghị với Sở GDĐT Đồng Tháp về quy hoạch, bổ nhiệm cán bộ quản lý (Ban Giám hiệu); quyết định theo thẩm quyền việc quy hoạch cấp ủy, bổ nhiệm tổ trưởng, tổ phó chuyên môn, nâng lương, thi đua khen thưởng và kỷ luật viên chức.</w:t>
       </w:r>
     </w:p>
     <w:p>
@@ -589,7 +607,7 @@
           <w:sz w:val="26"/>
           <w:szCs w:val="26"/>
         </w:rPr>
-        <w:t xml:space="preserve">10. Định kỳ tổ chức tự phê bình và phê bình, lấy phiếu tín nhiệm cán bộ quản lý theo quy định; thực hiện nghiêm túc chế độ báo cáo định kỳ và đột xuất với Huyện ủy Tháp Mười và cơ quan quản lý chuyên môn.</w:t>
+        <w:t xml:space="preserve">10. Định kỳ tổ chức tự phê bình và phê bình, lấy phiếu tín nhiệm cán bộ quản lý theo quy định; thực hiện nghiêm túc chế độ báo cáo định kỳ và đột xuất với Ban Thường vụ Đảng ủy xã Đốc Binh Kiều và Sở GDĐT Đồng Tháp.</w:t>
       </w:r>
     </w:p>
     <w:p>
@@ -731,7 +749,7 @@
           <w:sz w:val="26"/>
           <w:szCs w:val="26"/>
         </w:rPr>
-        <w:t xml:space="preserve">1. Là người đứng đầu Ban Chấp hành Đảng bộ, chịu trách nhiệm cao nhất trước Huyện ủy Tháp Mười, Giám đốc Sở GDĐT và Đảng bộ trường về toàn bộ hoạt động lãnh đạo của Đảng ủy và nhà trường trên cả 03 điểm trường.</w:t>
+        <w:t xml:space="preserve">1. Là người đứng đầu Ban Chấp hành Đảng bộ, chịu trách nhiệm cao nhất trước Đảng ủy xã Đốc Binh Kiều, Giám đốc Sở GDĐT và Đảng bộ trường về toàn bộ hoạt động lãnh đạo của Đảng ủy và nhà trường trên cả 03 điểm trường.</w:t>
       </w:r>
     </w:p>
     <w:p>
@@ -803,25 +821,25 @@
           <w:sz w:val="26"/>
           <w:szCs w:val="26"/>
         </w:rPr>
-        <w:t xml:space="preserve">5. Thay mặt Ban Chấp hành Đảng bộ ký các nghị quyết, chỉ thị, kế hoạch, chương trình hành động, tờ trình gửi cấp ủy cấp trên và các văn bản chỉ đạo quan trọng của Đảng ủy.</w:t>
-      </w:r>
-    </w:p>
-    <w:p>
-      <w:pPr>
-        <w:spacing w:after="60" w:before="60" w:line="276"/>
-        <w:jc w:val="both"/>
-      </w:pPr>
-      <w:r>
-        <w:rPr>
-          <w:rFonts w:ascii="Times New Roman" w:cs="Times New Roman" w:eastAsia="Times New Roman" w:hAnsi="Times New Roman"/>
-          <w:b w:val="false"/>
-          <w:bCs w:val="false"/>
-          <w:i w:val="false"/>
-          <w:iCs w:val="false"/>
-          <w:sz w:val="26"/>
-          <w:szCs w:val="26"/>
-        </w:rPr>
-        <w:t xml:space="preserve">6. Giữ mối liên hệ công tác thường xuyên với Thường trực Huyện ủy Tháp Mười, Lãnh đạo Sở GDĐT Đồng Tháp, Đảng ủy và UBND xã Đốc Binh Kiều, xã Tân Kiều.</w:t>
+        <w:t xml:space="preserve">5. Thay mặt Ban Chấp hành Đảng bộ ký các nghị quyết, chỉ thị, kế hoạch, chương trình hành động, tờ trình gửi Đảng ủy xã Đốc Binh Kiều, Sở GDĐT và các văn bản chỉ đạo quan trọng của Đảng ủy.</w:t>
+      </w:r>
+    </w:p>
+    <w:p>
+      <w:pPr>
+        <w:spacing w:after="60" w:before="60" w:line="276"/>
+        <w:jc w:val="both"/>
+      </w:pPr>
+      <w:r>
+        <w:rPr>
+          <w:rFonts w:ascii="Times New Roman" w:cs="Times New Roman" w:eastAsia="Times New Roman" w:hAnsi="Times New Roman"/>
+          <w:b w:val="false"/>
+          <w:bCs w:val="false"/>
+          <w:i w:val="false"/>
+          <w:iCs w:val="false"/>
+          <w:sz w:val="26"/>
+          <w:szCs w:val="26"/>
+        </w:rPr>
+        <w:t xml:space="preserve">6. Giữ mối liên hệ công tác thường xuyên với Thường trực Đảng ủy xã Đốc Binh Kiều, HĐND, UBND xã Đốc Binh Kiều và Lãnh đạo Sở GDĐT Đồng Tháp.</w:t>
       </w:r>
     </w:p>
     <w:p>
@@ -910,7 +928,7 @@
           <w:sz w:val="26"/>
           <w:szCs w:val="26"/>
         </w:rPr>
-        <w:t xml:space="preserve">4. Về chuyên môn chính quyền: Trực tiếp phụ trách công tác chuyên môn cấp THPT (14 lớp, 529 học sinh), kế hoạch ôn thi tốt nghiệp THPT, kỳ thi chọn học sinh giỏi THPT và nề nếp kỷ cương học sinh cấp THPT tại điểm chính.</w:t>
+        <w:t xml:space="preserve">4. Về chuyên môn chính quyền: Trực tiếp phụ trách công tác chuyên môn cấp THPT (14 lớp, 529 học sinh), kế hoạch ôn thi tốt nghiệp THPT, kỳ thi chọn học sinh giỏi cấp THPT và nề nếp kỷ cương học sinh cấp THPT tại điểm chính.</w:t>
       </w:r>
     </w:p>
     <w:p>
@@ -1070,25 +1088,25 @@
           <w:sz w:val="26"/>
           <w:szCs w:val="26"/>
         </w:rPr>
-        <w:t xml:space="preserve">2. Trực tiếp phụ trách điều hành mọi mặt hoạt động chuyên môn, cơ sở vật chất, an ninh trật tự, nề nếp học sinh tại Điểm trường Tân Kiều (cơ sở cách điểm chính 11km).</w:t>
-      </w:r>
-    </w:p>
-    <w:p>
-      <w:pPr>
-        <w:spacing w:after="60" w:before="60" w:line="276"/>
-        <w:jc w:val="both"/>
-      </w:pPr>
-      <w:r>
-        <w:rPr>
-          <w:rFonts w:ascii="Times New Roman" w:cs="Times New Roman" w:eastAsia="Times New Roman" w:hAnsi="Times New Roman"/>
-          <w:b w:val="false"/>
-          <w:bCs w:val="false"/>
-          <w:i w:val="false"/>
-          <w:iCs w:val="false"/>
-          <w:sz w:val="26"/>
-          <w:szCs w:val="26"/>
-        </w:rPr>
-        <w:t xml:space="preserve">3. Giữ mối quan hệ phối hợp thường xuyên với Đảng ủy, HĐND, UBND, Ủy ban MTTQ Việt Nam và các đoàn thể xã Tân Kiều nhằm làm tốt công tác xã hội hóa giáo dục, duy trì sĩ số, phòng chống bỏ học.</w:t>
+        <w:t xml:space="preserve">2. Trực tiếp phụ trách điều hành mọi mặt hoạt động chuyên môn, cơ sở vật chất, an ninh trật tự, nề nếp học sinh tại Điểm trường Tân Kiều (cơ sở cách điểm chính 11km thuộc xã Đốc Binh Kiều).</w:t>
+      </w:r>
+    </w:p>
+    <w:p>
+      <w:pPr>
+        <w:spacing w:after="60" w:before="60" w:line="276"/>
+        <w:jc w:val="both"/>
+      </w:pPr>
+      <w:r>
+        <w:rPr>
+          <w:rFonts w:ascii="Times New Roman" w:cs="Times New Roman" w:eastAsia="Times New Roman" w:hAnsi="Times New Roman"/>
+          <w:b w:val="false"/>
+          <w:bCs w:val="false"/>
+          <w:i w:val="false"/>
+          <w:iCs w:val="false"/>
+          <w:sz w:val="26"/>
+          <w:szCs w:val="26"/>
+        </w:rPr>
+        <w:t xml:space="preserve">3. Giữ mối quan hệ phối hợp thường xuyên với Đảng ủy, HĐND, UBND, Ủy ban MTTQ Việt Nam xã Đốc Binh Kiều và các cơ quan đóng trên địa bàn Tân Kiều nhằm làm tốt công tác xã hội hóa giáo dục, duy trì sĩ số, phòng chống bỏ học.</w:t>
       </w:r>
     </w:p>
     <w:p>
@@ -1248,7 +1266,7 @@
           <w:sz w:val="26"/>
           <w:szCs w:val="26"/>
         </w:rPr>
-        <w:t xml:space="preserve">2. Hướng dẫn, thẩm định và chuẩn bị đầy đủ hồ sơ trình Đảng ủy xem xét, đề nghị cấp trên quyết định kết nạp đảng viên mới và công nhận đảng viên chính thức đúng quy trình, tiêu chuẩn.</w:t>
+        <w:t xml:space="preserve">2. Hướng dẫn, thẩm định và chuẩn bị đầy đủ hồ sơ trình Đảng ủy xem xét, đề nghị Đảng ủy xã Đốc Binh Kiều quyết định kết nạp đảng viên mới và công nhận đảng viên chính thức đúng quy trình, tiêu chuẩn.</w:t>
       </w:r>
     </w:p>
     <w:p>
@@ -1622,7 +1640,7 @@
           <w:sz w:val="26"/>
           <w:szCs w:val="26"/>
         </w:rPr>
-        <w:t xml:space="preserve">3. Hướng dẫn, theo dõi, đôn đốc 03 chi bộ thực hiện việc thu, nộp đảng phí hàng tháng đúng quy định; thực hiện trích nộp đảng phí về Huyện ủy Tháp Mười đầy đủ, đúng thời hạn; lập dự toán và quyết toán kinh phí hoạt động đảng vụ công khai, minh bạch.</w:t>
+        <w:t xml:space="preserve">3. Hướng dẫn, theo dõi, đôn đốc 03 chi bộ thực hiện việc thu, nộp đảng phí hàng tháng đúng quy định; thực hiện trích nộp đảng phí về Đảng ủy xã Đốc Binh Kiều đầy đủ, đúng thời hạn; lập dự toán và quyết toán kinh phí hoạt động đảng vụ công khai, minh bạch.</w:t>
       </w:r>
     </w:p>
     <w:p>
@@ -1835,7 +1853,7 @@
           <w:sz w:val="26"/>
           <w:szCs w:val="26"/>
         </w:rPr>
-        <w:t xml:space="preserve">1. Thực hiện nghiêm chế độ báo cáo định kỳ tháng, quý, 6 tháng, 9 tháng, năm và báo cáo đột xuất gửi Ban Thường vụ Huyện ủy Tháp Mười và Đảng ủy cấp trên.</w:t>
+        <w:t xml:space="preserve">1. Thực hiện nghiêm chế độ báo cáo định kỳ tháng, quý, 6 tháng, 9 tháng, năm và báo cáo đột xuất gửi Ban Thường vụ Đảng ủy xã Đốc Binh Kiều.</w:t>
       </w:r>
     </w:p>
     <w:p>
@@ -2012,25 +2030,25 @@
           <w:sz w:val="26"/>
           <w:szCs w:val="26"/>
         </w:rPr>
-        <w:t xml:space="preserve">Điều 18. Với Huyện ủy Tháp Mười và cơ quan cấp trên trực tiếp</w:t>
-      </w:r>
-    </w:p>
-    <w:p>
-      <w:pPr>
-        <w:spacing w:after="60" w:before="60" w:line="276"/>
-        <w:jc w:val="both"/>
-      </w:pPr>
-      <w:r>
-        <w:rPr>
-          <w:rFonts w:ascii="Times New Roman" w:cs="Times New Roman" w:eastAsia="Times New Roman" w:hAnsi="Times New Roman"/>
-          <w:b w:val="false"/>
-          <w:bCs w:val="false"/>
-          <w:i w:val="false"/>
-          <w:iCs w:val="false"/>
-          <w:sz w:val="26"/>
-          <w:szCs w:val="26"/>
-        </w:rPr>
-        <w:t xml:space="preserve">Đảng ủy chịu sự lãnh đạo, chỉ đạo trực tiếp, toàn diện của Ban Chấp hành, Ban Thường vụ Huyện ủy Tháp Mười; chấp hành nghiêm các nghị quyết, chỉ thị, quy định và sự kiểm tra, giám sát của cấp ủy cấp trên.</w:t>
+        <w:t xml:space="preserve">Điều 18. Với Đảng ủy xã Đốc Binh Kiều (Cấp ủy cấp trên trực tiếp)</w:t>
+      </w:r>
+    </w:p>
+    <w:p>
+      <w:pPr>
+        <w:spacing w:after="60" w:before="60" w:line="276"/>
+        <w:jc w:val="both"/>
+      </w:pPr>
+      <w:r>
+        <w:rPr>
+          <w:rFonts w:ascii="Times New Roman" w:cs="Times New Roman" w:eastAsia="Times New Roman" w:hAnsi="Times New Roman"/>
+          <w:b w:val="false"/>
+          <w:bCs w:val="false"/>
+          <w:i w:val="false"/>
+          <w:iCs w:val="false"/>
+          <w:sz w:val="26"/>
+          <w:szCs w:val="26"/>
+        </w:rPr>
+        <w:t xml:space="preserve">Đảng ủy chịu sự lãnh đạo, chỉ đạo trực tiếp, toàn diện của Ban Chấp hành, Ban Thường vụ Đảng ủy xã Đốc Binh Kiều; chấp hành nghiêm các nghị quyết, chỉ thị, quy định và sự kiểm tra, giám sát của cấp ủy cấp trên.</w:t>
       </w:r>
     </w:p>
     <w:p>
@@ -2082,25 +2100,25 @@
           <w:sz w:val="26"/>
           <w:szCs w:val="26"/>
         </w:rPr>
-        <w:t xml:space="preserve">Điều 20. Với Đảng ủy, HĐND, UBND xã Đốc Binh Kiều và xã Tân Kiều</w:t>
-      </w:r>
-    </w:p>
-    <w:p>
-      <w:pPr>
-        <w:spacing w:after="60" w:before="60" w:line="276"/>
-        <w:jc w:val="both"/>
-      </w:pPr>
-      <w:r>
-        <w:rPr>
-          <w:rFonts w:ascii="Times New Roman" w:cs="Times New Roman" w:eastAsia="Times New Roman" w:hAnsi="Times New Roman"/>
-          <w:b w:val="false"/>
-          <w:bCs w:val="false"/>
-          <w:i w:val="false"/>
-          <w:iCs w:val="false"/>
-          <w:sz w:val="26"/>
-          <w:szCs w:val="26"/>
-        </w:rPr>
-        <w:t xml:space="preserve">Đảng ủy giữ mối quan hệ phối hợp chặt chẽ với Đảng ủy, chính quyền 02 xã nơi trường đặt cơ sở để giữ gìn an ninh trật tự trường học, an toàn giao thông, quản lý học sinh ngoài giờ và phối hợp thực hiện tốt công tác giáo dục tại địa phương.</w:t>
+        <w:t xml:space="preserve">Điều 20. Với Hội đồng nhân dân, Ủy ban nhân dân xã Đốc Binh Kiều</w:t>
+      </w:r>
+    </w:p>
+    <w:p>
+      <w:pPr>
+        <w:spacing w:after="60" w:before="60" w:line="276"/>
+        <w:jc w:val="both"/>
+      </w:pPr>
+      <w:r>
+        <w:rPr>
+          <w:rFonts w:ascii="Times New Roman" w:cs="Times New Roman" w:eastAsia="Times New Roman" w:hAnsi="Times New Roman"/>
+          <w:b w:val="false"/>
+          <w:bCs w:val="false"/>
+          <w:i w:val="false"/>
+          <w:iCs w:val="false"/>
+          <w:sz w:val="26"/>
+          <w:szCs w:val="26"/>
+        </w:rPr>
+        <w:t xml:space="preserve">Đảng ủy giữ mối quan hệ phối hợp chặt chẽ với Thường trực HĐND, UBND xã Đốc Binh Kiều nhằm phối hợp giữ gìn an ninh trật tự trường học, an toàn giao thông, quản lý học sinh ngoài giờ và phối hợp thực hiện tốt công tác xã hội hóa giáo dục trên toàn địa bàn xã (bao gồm cả khu vực Tân Kiều).</w:t>
       </w:r>
     </w:p>
     <w:p>
@@ -2316,7 +2334,7 @@
                 <w:sz w:val="20"/>
                 <w:szCs w:val="20"/>
               </w:rPr>
-              <w:t xml:space="preserve">- Ban Thường vụ Huyện ủy Tháp Mười (b/c);</w:t>
+              <w:t xml:space="preserve">- Ban Thường vụ Đảng ủy xã Đốc Binh Kiều (để báo cáo);</w:t>
             </w:r>
           </w:p>
           <w:p>
@@ -2329,7 +2347,7 @@
                 <w:sz w:val="20"/>
                 <w:szCs w:val="20"/>
               </w:rPr>
-              <w:t xml:space="preserve">- Sở GDĐT Đồng Tháp (b/c);</w:t>
+              <w:t xml:space="preserve">- Sở GDĐT Đồng Tháp (để báo cáo);</w:t>
             </w:r>
           </w:p>
           <w:p>
@@ -2342,7 +2360,7 @@
                 <w:sz w:val="20"/>
                 <w:szCs w:val="20"/>
               </w:rPr>
-              <w:t xml:space="preserve">- Đảng ủy xã Đốc Binh Kiều &amp; xã Tân Kiều (p/h);</w:t>
+              <w:t xml:space="preserve">- HĐND, UBND xã Đốc Binh Kiều (để phối hợp);</w:t>
             </w:r>
           </w:p>
           <w:p>

</xml_diff>